<commit_message>
Page fit on every PDF and Word file (D71), the language sweep in the downloads, and two pandoc traps closed
pagefit.py runs inside build_downloads.py on every rebuild: a last page
with fewer than a quarter of a full page's lines gets tighter margins
until the page disappears, or a little more line spacing until it fills,
in the Word file and the PDF together. Two markdown habits were turning
into page breaks in pandoc: a writing line of underscores and a cut line
of spaced dashes; both are escaped now, which took a three page handout
back from twenty pages. 629 PDFs, no blank page anywhere, 21 documents
whose short last page follows the author's own page break are left as
written. The 248 files from the language sweep are rebuilt.

Co-Authored-By: Claude Fable 5.1 <noreply@anthropic.com>
Claude-Session: https://claude.ai/code/session_01TaQLEJCtq2ruLJPqxdFc8k
</commit_message>
<xml_diff>
--- a/downloads/documents/04 Units/Unit 00 - Launch - Welcome to the FACS Room/Lesson 00.01 - What Is FACS and Who Is in This Room.docx
+++ b/downloads/documents/04 Units/Unit 00 - Launch - Welcome to the FACS Room/Lesson 00.01 - What Is FACS and Who Is in This Room.docx
@@ -288,7 +288,7 @@
         <w:t xml:space="preserve"> </w:t>
       </w:r>
       <w:r>
-        <w:t xml:space="preserve">Tier 3 (FACS): FACS (Family and Consumer Sciences), do now, exit card, hope card. See the unit vocabulary list for Turkish, Portuguese, and Spanish.</w:t>
+        <w:t xml:space="preserve">Tier 3 (FACS): FACS (Family and Consumer Sciences), do now, exit card, hope card. See the unit vocabulary list for the Spanish column.</w:t>
       </w:r>
     </w:p>
     <w:p>
@@ -1160,7 +1160,7 @@
         <w:pStyle w:val="Compact"/>
       </w:pPr>
       <w:r>
-        <w:t xml:space="preserve">ELL: the six module names on the slide have the six objects as pictures; the handout has the module names in Turkish, Portuguese, and Spanish (see</w:t>
+        <w:t xml:space="preserve">ELL: the six module names on the slide have the six objects as pictures; the handout has the module names in Spanish (see</w:t>
       </w:r>
       <w:r>
         <w:t xml:space="preserve"> </w:t>

</xml_diff>